<commit_message>
docs: align the V3 specification with the current system
Remove the PWA, CI, Mercado Pago integration and automatic reminders,
document the simulated Premium payment and the delegable ERP modules,
and fix the business rules about reminders.
</commit_message>
<xml_diff>
--- a/PetCloud/docs/Libreta Sanitaria Digital - V3 2026.docx
+++ b/PetCloud/docs/Libreta Sanitaria Digital - V3 2026.docx
@@ -491,7 +491,7 @@
                 <w:sz w:val="19"/>
                 <w:szCs w:val="19"/>
               </w:rPr>
-              <w:t>Simplificación del alcance para la entrega académica. Se quitan el rol Municipio, mascota perdida, las notificaciones y los emails; el Administrador queda solo para validar matrículas. Migración de Supabase y Vercel a Microsoft Azure (PostgreSQL) con ejecución local, y pago Premium simulado.</w:t>
+              <w:t>Simplificación del alcance para la entrega académica. Se quitan el rol Municipio, mascota perdida, las notificaciones y los emails; el Administrador queda solo para validar matrículas. Migración de Supabase y Vercel a Microsoft Azure (PostgreSQL) con ejecución local. Se quitan la PWA, la integración continua y la integración con Mercado Pago (el pago Premium se simula); los recordatorios automáticos quedan fuera del alcance.</w:t>
             </w:r>
           </w:p>
         </w:tc>
@@ -581,7 +581,7 @@
       </w:r>
       <w:r>
         <w:rPr/>
-        <w:t xml:space="preserve"> vacunas, consultas y tratamientos. Toda la información queda en un solo lugar y con recordatorios automáticos dentro de la aplicación.</w:t>
+        <w:t xml:space="preserve"> vacunas, consultas y tratamientos. Toda la información queda en un solo lugar, con recordatorios que el dueño crea y consulta dentro de la aplicación.</w:t>
       </w:r>
     </w:p>
     <w:p>
@@ -636,7 +636,7 @@
       </w:r>
       <w:r>
         <w:rPr/>
-        <w:t xml:space="preserve"> (agenda de turnos y ERP de gestión) mediante Mercado Pago. En esta entrega la aprobación del pago se simula.</w:t>
+        <w:t xml:space="preserve"> (agenda de turnos y ERP de gestión). En esta entrega el pago se simula dentro de la aplicación; la integración con una pasarela de pago queda prevista.</w:t>
       </w:r>
     </w:p>
     <w:p>
@@ -713,7 +713,7 @@
       </w:r>
       <w:r>
         <w:rPr/>
-        <w:t xml:space="preserve"> debe funcionar en computadoras, celulares y tablets (web responsive + PWA instalable).</w:t>
+        <w:t xml:space="preserve"> debe funcionar en computadoras, celulares y tablets (aplicación web responsive).</w:t>
       </w:r>
     </w:p>
     <w:p>
@@ -779,7 +779,7 @@
       </w:r>
       <w:r>
         <w:rPr/>
-        <w:t xml:space="preserve"> Microsoft Azure (base de datos PostgreSQL y despliegue previsto) y Mercado Pago (pagos, en modo simulado para la entrega).</w:t>
+        <w:t xml:space="preserve"> Microsoft Azure (base de datos PostgreSQL y despliegue previsto). El pago Premium se simula; la integración con una pasarela de pago queda prevista.</w:t>
       </w:r>
     </w:p>
     <w:p>
@@ -898,7 +898,7 @@
       </w:pPr>
       <w:r>
         <w:rPr/>
-        <w:t>Recordatorios manuales y automáticos de vacunas y antiparasitarios, visibles dentro de la aplicación.</w:t>
+        <w:t>Recordatorios manuales creados por el dueño, visibles dentro de la aplicación, y plan de próximas dosis de vacunas.</w:t>
       </w:r>
     </w:p>
     <w:p>
@@ -1562,7 +1562,7 @@
       </w:pPr>
       <w:r>
         <w:rPr/>
-        <w:t>Aplicación web responsive (escritorio primero) instalable como PWA, en español de Argentina.</w:t>
+        <w:t>Aplicación web responsive (escritorio primero), en español de Argentina.</w:t>
       </w:r>
     </w:p>
     <w:p>
@@ -1622,7 +1622,7 @@
       </w:pPr>
       <w:r>
         <w:rPr/>
-        <w:t>Recordatorios manuales y automáticos visibles dentro de la aplicación.</w:t>
+        <w:t>Recordatorios manuales visibles dentro de la aplicación.</w:t>
       </w:r>
     </w:p>
     <w:p>
@@ -1652,7 +1652,7 @@
       </w:pPr>
       <w:r>
         <w:rPr/>
-        <w:t>Plan Premium para veterinarias con agenda de turnos y ERP; el pago con Mercado Pago se simula en esta entrega.</w:t>
+        <w:t>Plan Premium para veterinarias con agenda de turnos y ERP; el pago se simula en esta entrega y la integración con una pasarela de pago queda prevista.</w:t>
       </w:r>
     </w:p>
     <w:p>
@@ -1745,7 +1745,7 @@
       </w:r>
       <w:r>
         <w:rPr/>
-        <w:t xml:space="preserve"> la PWA se puede instalar, pero sin conexión solo muestra la página pública de inicio; no hay sincronización de datos.</w:t>
+        <w:t xml:space="preserve"> la aplicación requiere conexión a internet y no es instalable; no hay sincronización de datos.</w:t>
       </w:r>
     </w:p>
     <w:p>
@@ -1820,7 +1820,7 @@
       </w:pPr>
       <w:r>
         <w:rPr/>
-        <w:t>Sin facturación electrónica en el ERP (planificada).</w:t>
+        <w:t>Sin facturación electrónica en el ERP: el módulo figura como «Próximamente».</w:t>
       </w:r>
     </w:p>
     <w:p>
@@ -2078,7 +2078,7 @@
       </w:pPr>
       <w:r>
         <w:rPr/>
-        <w:t>La pantalla de Inicio debe mostrar el resumen de la mascota activa, próximas dosis, próximos turnos, invitaciones pendientes y últimos registros.</w:t>
+        <w:t>La pantalla de Inicio debe mostrar el resumen de la mascota activa, próximos turnos, invitaciones pendientes y últimos registros.</w:t>
       </w:r>
     </w:p>
     <w:p>
@@ -2138,7 +2138,7 @@
       </w:pPr>
       <w:r>
         <w:rPr/>
-        <w:t>El sistema debe permitir crear recordatorios manuales (título, fecha, repetición única/diaria/semanal/mensual/anual) y generar automáticamente recordatorios de vacunas y antiparasitarios. Los recordatorios se muestran dentro de la aplicación.</w:t>
+        <w:t>El sistema debe permitir crear, editar y eliminar recordatorios manuales (título, fecha, repetición única/diaria/semanal/mensual/anual). Los recordatorios se muestran dentro de la aplicación.</w:t>
       </w:r>
     </w:p>
     <w:p>
@@ -2389,7 +2389,7 @@
       </w:pPr>
       <w:r>
         <w:rPr/>
-        <w:t>Premium: contratar la suscripción mediante Mercado Pago; en esta entrega la aprobación del pago se simula.</w:t>
+        <w:t>Premium: contratar la suscripción con un pago simulado dentro de la aplicación; la integración con una pasarela de pago queda prevista.</w:t>
       </w:r>
     </w:p>
     <w:p>
@@ -2490,7 +2490,7 @@
       </w:pPr>
       <w:r>
         <w:rPr/>
-        <w:t>Permisos por módulo (stock, ventas, caja, compras, reportes, equipo) delegables a cada profesional.</w:t>
+        <w:t>Permisos por módulo: caja, compras, reportes y equipo se delegan a cada profesional; stock y ventas están disponibles para todo profesional de la institución Premium.</w:t>
       </w:r>
     </w:p>
     <w:p>
@@ -2726,7 +2726,7 @@
       </w:r>
       <w:r>
         <w:rPr/>
-        <w:t xml:space="preserve"> funcionar en navegadores modernos de computadoras, celulares y tablets, e instalarse como PWA.</w:t>
+        <w:t xml:space="preserve"> funcionar en navegadores modernos de computadoras, celulares y tablets.</w:t>
       </w:r>
     </w:p>
     <w:p>
@@ -2770,7 +2770,7 @@
       </w:r>
       <w:r>
         <w:rPr/>
-        <w:t xml:space="preserve"> pruebas unitarias automatizadas con Vitest, ejecutadas en integración continua (GitHub Actions) junto con lint y tipado.</w:t>
+        <w:t xml:space="preserve"> pruebas unitarias con Vitest ejecutadas localmente (npm test), junto con lint (ESLint) y verificación de tipos (TypeScript).</w:t>
       </w:r>
     </w:p>
     <w:p>
@@ -2989,7 +2989,7 @@
                 <w:sz w:val="19"/>
                 <w:szCs w:val="19"/>
               </w:rPr>
-              <w:t>Tailwind CSS 4, íconos Lucide, gráficos Recharts, mapas Leaflet</w:t>
+              <w:t>Tailwind CSS 4, íconos Lucide, mapas Leaflet</w:t>
             </w:r>
           </w:p>
         </w:tc>
@@ -3319,7 +3319,7 @@
                 <w:sz w:val="19"/>
                 <w:szCs w:val="19"/>
               </w:rPr>
-              <w:t>Mercado Pago (suscripción Premium, modo simulado)</w:t>
+              <w:t>Suscripción Premium con pago simulado; integración con una pasarela de pago prevista</w:t>
             </w:r>
           </w:p>
         </w:tc>
@@ -3430,61 +3430,6 @@
                 <w:szCs w:val="19"/>
               </w:rPr>
               <w:t>localhost para la entrega; despliegue previsto en Microsoft Azure</w:t>
-            </w:r>
-          </w:p>
-        </w:tc>
-      </w:tr>
-      <w:tr>
-        <w:trPr/>
-        <w:tc>
-          <w:tcPr>
-            <w:tcW w:w="2600" w:type="dxa"/>
-            <w:tcBorders>
-              <w:top w:val="single" w:sz="4" w:space="0" w:color="000000"/>
-              <w:start w:val="single" w:sz="4" w:space="0" w:color="000000"/>
-              <w:bottom w:val="single" w:sz="4" w:space="0" w:color="000000"/>
-              <w:end w:val="single" w:sz="4" w:space="0" w:color="000000"/>
-            </w:tcBorders>
-          </w:tcPr>
-          <w:p>
-            <w:pPr>
-              <w:pStyle w:val="Normal"/>
-              <w:rPr/>
-            </w:pPr>
-            <w:r>
-              <w:rPr>
-                <w:b w:val="false"/>
-                <w:bCs w:val="false"/>
-                <w:sz w:val="19"/>
-                <w:szCs w:val="19"/>
-              </w:rPr>
-              <w:t>Integración continua</w:t>
-            </w:r>
-          </w:p>
-        </w:tc>
-        <w:tc>
-          <w:tcPr>
-            <w:tcW w:w="6426" w:type="dxa"/>
-            <w:tcBorders>
-              <w:top w:val="single" w:sz="4" w:space="0" w:color="000000"/>
-              <w:start w:val="single" w:sz="4" w:space="0" w:color="000000"/>
-              <w:bottom w:val="single" w:sz="4" w:space="0" w:color="000000"/>
-              <w:end w:val="single" w:sz="4" w:space="0" w:color="000000"/>
-            </w:tcBorders>
-          </w:tcPr>
-          <w:p>
-            <w:pPr>
-              <w:pStyle w:val="Normal"/>
-              <w:rPr/>
-            </w:pPr>
-            <w:r>
-              <w:rPr>
-                <w:b w:val="false"/>
-                <w:bCs w:val="false"/>
-                <w:sz w:val="19"/>
-                <w:szCs w:val="19"/>
-              </w:rPr>
-              <w:t>GitHub Actions (lint, tipado, tests)</w:t>
             </w:r>
           </w:p>
         </w:tc>
@@ -5019,7 +4964,7 @@
                 <w:sz w:val="19"/>
                 <w:szCs w:val="19"/>
               </w:rPr>
-              <w:t>título, fecha, repetición, origen (manual | automático), estado</w:t>
+              <w:t>título, descripción, fecha, repetición, estado</w:t>
             </w:r>
           </w:p>
         </w:tc>

</xml_diff>

<commit_message>
docs: replace markdown guides with the specification and a class diagram
- remove the markdown guides; the V3 specification is the single source
- add the class diagram image and embed it in the specification
- simplify technical wording in the specification
- show the diagram and local setup steps in the root README
</commit_message>
<xml_diff>
--- a/PetCloud/docs/Libreta Sanitaria Digital - V3 2026.docx
+++ b/PetCloud/docs/Libreta Sanitaria Digital - V3 2026.docx
@@ -1667,7 +1667,7 @@
       </w:pPr>
       <w:r>
         <w:rPr/>
-        <w:t>Ejecución en entorno local (localhost) para la entrega; despliegue previsto en Microsoft Azure.</w:t>
+        <w:t>Ejecución en una computadora local para la entrega; publicación prevista en Microsoft Azure.</w:t>
       </w:r>
     </w:p>
     <w:p>
@@ -2594,7 +2594,7 @@
       </w:r>
       <w:r>
         <w:rPr/>
-        <w:t xml:space="preserve"> autenticación con Auth.js (contraseñas almacenadas con hash bcrypt), comunicación cifrada por HTTPS en producción y control de acceso en el servidor de la aplicación. El control de acceso a nivel de base de datos (Row Level Security) está previsto para una etapa posterior.</w:t>
+        <w:t xml:space="preserve"> cada usuario ingresa con su email y contraseña (guardada cifrada), la comunicación viaja cifrada y el sistema controla qué puede ver y hacer cada perfil. Un control adicional dentro de la base de datos queda previsto para una etapa posterior.</w:t>
       </w:r>
     </w:p>
     <w:p>
@@ -2660,7 +2660,7 @@
       </w:r>
       <w:r>
         <w:rPr/>
-        <w:t xml:space="preserve"> al menos 95% mensual una vez desplegado, apoyada en Microsoft Azure y en Azure Database for PostgreSQL. Para la entrega académica el sistema se ejecuta en localhost.</w:t>
+        <w:t xml:space="preserve"> al menos 95% del tiempo mensual una vez publicado en Microsoft Azure. Para la entrega académica el sistema se ejecuta en una computadora local.</w:t>
       </w:r>
     </w:p>
     <w:p>
@@ -2682,7 +2682,7 @@
       </w:r>
       <w:r>
         <w:rPr/>
-        <w:t xml:space="preserve"> la arquitectura con Next.js y PostgreSQL debe soportar el crecimiento de usuarios, mascotas y registros sin degradar el rendimiento.</w:t>
+        <w:t xml:space="preserve"> el sistema debe soportar el crecimiento de usuarios, mascotas y registros sin volverse más lento.</w:t>
       </w:r>
     </w:p>
     <w:p>
@@ -2704,7 +2704,7 @@
       </w:r>
       <w:r>
         <w:rPr/>
-        <w:t xml:space="preserve"> backups automáticos del servicio Azure Database for PostgreSQL.</w:t>
+        <w:t xml:space="preserve"> copias de seguridad automáticas de la base de datos.</w:t>
       </w:r>
     </w:p>
     <w:p>
@@ -2934,7 +2934,7 @@
                 <w:sz w:val="19"/>
                 <w:szCs w:val="19"/>
               </w:rPr>
-              <w:t>Next.js 16 (App Router, Server Actions), React 19, TypeScript</w:t>
+              <w:t>Next.js 16, React 19 y TypeScript</w:t>
             </w:r>
           </w:p>
         </w:tc>
@@ -2989,7 +2989,7 @@
                 <w:sz w:val="19"/>
                 <w:szCs w:val="19"/>
               </w:rPr>
-              <w:t>Tailwind CSS 4, íconos Lucide, mapas Leaflet</w:t>
+              <w:t>Tailwind CSS, íconos Lucide y mapas Leaflet</w:t>
             </w:r>
           </w:p>
         </w:tc>
@@ -3044,7 +3044,7 @@
                 <w:sz w:val="19"/>
                 <w:szCs w:val="19"/>
               </w:rPr>
-              <w:t>React Hook Form + Zod</w:t>
+              <w:t>React Hook Form y Zod (validación de datos)</w:t>
             </w:r>
           </w:p>
         </w:tc>
@@ -3099,7 +3099,7 @@
                 <w:sz w:val="19"/>
                 <w:szCs w:val="19"/>
               </w:rPr>
-              <w:t>PostgreSQL 16 en Azure Database for PostgreSQL (Flexible Server), esquemas public y erp</w:t>
+              <w:t>PostgreSQL 16 en Azure, con una sección separada para el ERP</w:t>
             </w:r>
           </w:p>
         </w:tc>
@@ -3154,7 +3154,7 @@
                 <w:sz w:val="19"/>
                 <w:szCs w:val="19"/>
               </w:rPr>
-              <w:t>Drizzle ORM</w:t>
+              <w:t>Drizzle</w:t>
             </w:r>
           </w:p>
         </w:tc>
@@ -3209,7 +3209,7 @@
                 <w:sz w:val="19"/>
                 <w:szCs w:val="19"/>
               </w:rPr>
-              <w:t>Auth.js (email y contraseña, contraseñas con hash bcrypt)</w:t>
+              <w:t>Auth.js (ingreso con email y contraseña; las contraseñas se guardan cifradas)</w:t>
             </w:r>
           </w:p>
         </w:tc>
@@ -3264,7 +3264,7 @@
                 <w:sz w:val="19"/>
                 <w:szCs w:val="19"/>
               </w:rPr>
-              <w:t>Almacenamiento local en desarrollo, preparado para Azure Blob Storage</w:t>
+              <w:t>Almacenamiento local, preparado para pasar a la nube de Azure</w:t>
             </w:r>
           </w:p>
         </w:tc>
@@ -3374,7 +3374,7 @@
                 <w:sz w:val="19"/>
                 <w:szCs w:val="19"/>
               </w:rPr>
-              <w:t>jsPDF, qrcode y qr-scanner</w:t>
+              <w:t>Librerías para generar PDF y para crear y leer códigos QR</w:t>
             </w:r>
           </w:p>
         </w:tc>
@@ -3429,7 +3429,7 @@
                 <w:sz w:val="19"/>
                 <w:szCs w:val="19"/>
               </w:rPr>
-              <w:t>localhost para la entrega; despliegue previsto en Microsoft Azure</w:t>
+              <w:t>Computadora local para la entrega; publicación prevista en Microsoft Azure</w:t>
             </w:r>
           </w:p>
         </w:tc>
@@ -3509,6 +3509,58 @@
       <w:r>
         <w:rPr/>
         <w:t>. El historial médico deja de ser una clase con listas: cada registro clínico es una entidad propia vinculada a la mascota.</w:t>
+      </w:r>
+    </w:p>
+    <w:p>
+      <w:pPr>
+        <w:spacing w:before="120" w:after="60"/>
+        <w:jc w:val="center"/>
+      </w:pPr>
+      <w:r>
+        <w:drawing>
+          <wp:inline distT="0" distB="0" distL="0" distR="0">
+            <wp:extent cx="5731510" cy="4871784"/>
+            <wp:docPr id="901" name="Diagrama de clases"/>
+            <a:graphic xmlns:a="http://schemas.openxmlformats.org/drawingml/2006/main">
+              <a:graphicData uri="http://schemas.openxmlformats.org/drawingml/2006/picture">
+                <pic:pic xmlns:pic="http://schemas.openxmlformats.org/drawingml/2006/picture">
+                  <pic:nvPicPr>
+                    <pic:cNvPr id="901" name="Diagrama de clases"/>
+                    <pic:cNvPicPr/>
+                  </pic:nvPicPr>
+                  <pic:blipFill>
+                    <a:blip r:embed="rIdImgCl"/>
+                    <a:stretch>
+                      <a:fillRect/>
+                    </a:stretch>
+                  </pic:blipFill>
+                  <pic:spPr>
+                    <a:xfrm>
+                      <a:off x="0" y="0"/>
+                      <a:ext cx="5731510" cy="4871784"/>
+                    </a:xfrm>
+                    <a:prstGeom prst="rect">
+                      <a:avLst/>
+                    </a:prstGeom>
+                  </pic:spPr>
+                </pic:pic>
+              </a:graphicData>
+            </a:graphic>
+          </wp:inline>
+        </w:drawing>
+      </w:r>
+    </w:p>
+    <w:p>
+      <w:pPr>
+        <w:spacing w:after="240"/>
+        <w:jc w:val="center"/>
+      </w:pPr>
+      <w:r>
+        <w:rPr>
+          <w:i/>
+          <w:sz w:val="20"/>
+        </w:rPr>
+        <w:t xml:space="preserve">Figura 1 – Diagrama de clases</w:t>
       </w:r>
     </w:p>
     <w:tbl>

</xml_diff>